<commit_message>
updating the plots to show current years and updating the word document with the results
the current year 2025 regulations are more similar with 2021-2024. So Sarah and Mikayla looked at the relationships of those years only to try to parse-out what the data is telling us
</commit_message>
<xml_diff>
--- a/End-of-season Historic escapement files/Coho_exploratory_analysis/Coho_CPUE_findings.docx
+++ b/End-of-season Historic escapement files/Coho_exploratory_analysis/Coho_CPUE_findings.docx
@@ -53,23 +53,13 @@
         </w:rPr>
         <w:t>Effort is based on the number of interviews from the CREST pull (</w:t>
       </w:r>
-      <w:proofErr w:type="spellStart"/>
       <w:r>
         <w:rPr>
           <w:rFonts w:asciiTheme="minorHAnsi" w:hAnsiTheme="minorHAnsi" w:cstheme="minorHAnsi"/>
           <w:b/>
           <w:bCs/>
         </w:rPr>
-        <w:t>ie</w:t>
-      </w:r>
-      <w:proofErr w:type="spellEnd"/>
-      <w:r>
-        <w:rPr>
-          <w:rFonts w:asciiTheme="minorHAnsi" w:hAnsiTheme="minorHAnsi" w:cstheme="minorHAnsi"/>
-          <w:b/>
-          <w:bCs/>
-        </w:rPr>
-        <w:t>. number of boats</w:t>
+        <w:t>ie. number of boats</w:t>
       </w:r>
       <w:r>
         <w:rPr>
@@ -101,23 +91,13 @@
         </w:rPr>
         <w:t>(</w:t>
       </w:r>
-      <w:proofErr w:type="spellStart"/>
       <w:r>
         <w:rPr>
           <w:rFonts w:asciiTheme="minorHAnsi" w:hAnsiTheme="minorHAnsi" w:cstheme="minorHAnsi"/>
           <w:b/>
           <w:bCs/>
         </w:rPr>
-        <w:t>ie</w:t>
-      </w:r>
-      <w:proofErr w:type="spellEnd"/>
-      <w:r>
-        <w:rPr>
-          <w:rFonts w:asciiTheme="minorHAnsi" w:hAnsiTheme="minorHAnsi" w:cstheme="minorHAnsi"/>
-          <w:b/>
-          <w:bCs/>
-        </w:rPr>
-        <w:t>. total catch</w:t>
+        <w:t>ie. total catch</w:t>
       </w:r>
       <w:r>
         <w:rPr>
@@ -692,10 +672,10 @@
         <w:tblLook w:val="04A0" w:firstRow="1" w:lastRow="0" w:firstColumn="1" w:lastColumn="0" w:noHBand="0" w:noVBand="1"/>
       </w:tblPr>
       <w:tblGrid>
-        <w:gridCol w:w="394"/>
-        <w:gridCol w:w="3098"/>
-        <w:gridCol w:w="2760"/>
-        <w:gridCol w:w="3098"/>
+        <w:gridCol w:w="413"/>
+        <w:gridCol w:w="3417"/>
+        <w:gridCol w:w="2103"/>
+        <w:gridCol w:w="3417"/>
       </w:tblGrid>
       <w:tr>
         <w:tc>
@@ -817,6 +797,7 @@
             <w:r>
               <w:rPr>
                 <w:rFonts w:asciiTheme="minorHAnsi" w:hAnsiTheme="minorHAnsi" w:cstheme="minorHAnsi"/>
+                <w:noProof/>
               </w:rPr>
               <w:drawing>
                 <wp:inline distT="0" distB="0" distL="0" distR="0" wp14:anchorId="08F24E61" wp14:editId="1E193F6D">
@@ -871,11 +852,12 @@
             <w:r>
               <w:rPr>
                 <w:rFonts w:asciiTheme="minorHAnsi" w:hAnsiTheme="minorHAnsi" w:cstheme="minorHAnsi"/>
+                <w:noProof/>
               </w:rPr>
               <w:drawing>
-                <wp:inline distT="0" distB="0" distL="0" distR="0" wp14:anchorId="2173E097" wp14:editId="2F31FCA3">
-                  <wp:extent cx="2539999" cy="1512482"/>
-                  <wp:effectExtent l="0" t="0" r="0" b="0"/>
+                <wp:inline distT="0" distB="0" distL="0" distR="0" wp14:anchorId="2173E097" wp14:editId="77FE80B0">
+                  <wp:extent cx="1270280" cy="756408"/>
+                  <wp:effectExtent l="0" t="0" r="6350" b="5715"/>
                   <wp:docPr id="769393076" name="Picture 1"/>
                   <wp:cNvGraphicFramePr>
                     <a:graphicFrameLocks xmlns:a="http://schemas.openxmlformats.org/drawingml/2006/main" noChangeAspect="1"/>
@@ -896,7 +878,7 @@
                         <pic:spPr>
                           <a:xfrm>
                             <a:off x="0" y="0"/>
-                            <a:ext cx="2550494" cy="1518731"/>
+                            <a:ext cx="1286561" cy="766103"/>
                           </a:xfrm>
                           <a:prstGeom prst="rect">
                             <a:avLst/>
@@ -925,6 +907,7 @@
             <w:r>
               <w:rPr>
                 <w:rFonts w:asciiTheme="minorHAnsi" w:hAnsiTheme="minorHAnsi" w:cstheme="minorHAnsi"/>
+                <w:noProof/>
               </w:rPr>
               <w:drawing>
                 <wp:inline distT="0" distB="0" distL="0" distR="0" wp14:anchorId="67759805" wp14:editId="54CF6A3F">
@@ -1008,6 +991,7 @@
             <w:r>
               <w:rPr>
                 <w:rFonts w:asciiTheme="minorHAnsi" w:hAnsiTheme="minorHAnsi" w:cstheme="minorHAnsi"/>
+                <w:noProof/>
               </w:rPr>
               <w:drawing>
                 <wp:inline distT="0" distB="0" distL="0" distR="0" wp14:anchorId="16D548FB" wp14:editId="7A55FFE9">
@@ -1062,6 +1046,7 @@
             <w:r>
               <w:rPr>
                 <w:rFonts w:asciiTheme="minorHAnsi" w:hAnsiTheme="minorHAnsi" w:cstheme="minorHAnsi"/>
+                <w:noProof/>
               </w:rPr>
               <w:drawing>
                 <wp:inline distT="0" distB="0" distL="0" distR="0" wp14:anchorId="08C149D4" wp14:editId="5C4884FD">
@@ -1116,6 +1101,7 @@
             <w:r>
               <w:rPr>
                 <w:rFonts w:asciiTheme="minorHAnsi" w:hAnsiTheme="minorHAnsi" w:cstheme="minorHAnsi"/>
+                <w:noProof/>
               </w:rPr>
               <w:drawing>
                 <wp:inline distT="0" distB="0" distL="0" distR="0" wp14:anchorId="7C545B3D" wp14:editId="1A5BC4FC">
@@ -1222,6 +1208,7 @@
             <w:r>
               <w:rPr>
                 <w:rFonts w:asciiTheme="minorHAnsi" w:hAnsiTheme="minorHAnsi" w:cstheme="minorHAnsi"/>
+                <w:noProof/>
               </w:rPr>
               <w:drawing>
                 <wp:inline distT="0" distB="0" distL="0" distR="0" wp14:anchorId="6D3E8299" wp14:editId="3D33C679">
@@ -1276,6 +1263,7 @@
             <w:r>
               <w:rPr>
                 <w:rFonts w:asciiTheme="minorHAnsi" w:hAnsiTheme="minorHAnsi" w:cstheme="minorHAnsi"/>
+                <w:noProof/>
               </w:rPr>
               <w:drawing>
                 <wp:inline distT="0" distB="0" distL="0" distR="0" wp14:anchorId="5A803A38" wp14:editId="4D621C11">
@@ -1330,6 +1318,7 @@
             <w:r>
               <w:rPr>
                 <w:rFonts w:asciiTheme="minorHAnsi" w:hAnsiTheme="minorHAnsi" w:cstheme="minorHAnsi"/>
+                <w:noProof/>
               </w:rPr>
               <w:drawing>
                 <wp:inline distT="0" distB="0" distL="0" distR="0" wp14:anchorId="3727CCC1" wp14:editId="26FF974B">
@@ -1419,13 +1408,7 @@
           <w:rFonts w:asciiTheme="minorHAnsi" w:hAnsiTheme="minorHAnsi" w:cstheme="minorHAnsi"/>
         </w:rPr>
         <w:br/>
-        <w:t>R-squared values:</w:t>
-      </w:r>
-      <w:r>
-        <w:rPr>
-          <w:rFonts w:asciiTheme="minorHAnsi" w:hAnsiTheme="minorHAnsi" w:cstheme="minorHAnsi"/>
-        </w:rPr>
-        <w:t xml:space="preserve"> (this looks at the total CPUE – not separated into sub-areas)</w:t>
+        <w:t>R-squared values: (this looks at the total CPUE – not separated into sub-areas)</w:t>
       </w:r>
     </w:p>
     <w:tbl>
@@ -1918,6 +1901,7 @@
       <w:pPr>
         <w:rPr>
           <w:rFonts w:cstheme="minorHAnsi"/>
+          <w:u w:val="single"/>
         </w:rPr>
       </w:pPr>
       <w:r>
@@ -1931,12 +1915,202 @@
           <w:rFonts w:cstheme="minorHAnsi"/>
         </w:rPr>
         <w:br/>
+      </w:r>
+      <w:r>
+        <w:rPr>
+          <w:rFonts w:cstheme="minorHAnsi"/>
+        </w:rPr>
+        <w:br/>
+      </w:r>
+      <w:r>
+        <w:rPr>
+          <w:rFonts w:cstheme="minorHAnsi"/>
+        </w:rPr>
+        <w:br/>
+      </w:r>
+      <w:r>
+        <w:rPr>
+          <w:rFonts w:cstheme="minorHAnsi"/>
+        </w:rPr>
+        <w:br/>
+      </w:r>
+      <w:r>
+        <w:rPr>
+          <w:rFonts w:cstheme="minorHAnsi"/>
+          <w:u w:val="single"/>
+        </w:rPr>
+        <w:t>Looking at the regulations:</w:t>
+      </w:r>
+    </w:p>
+    <w:p>
+      <w:pPr>
+        <w:pStyle w:val="ListParagraph"/>
+        <w:numPr>
+          <w:ilvl w:val="0"/>
+          <w:numId w:val="2"/>
+        </w:numPr>
+        <w:rPr>
+          <w:rFonts w:cstheme="minorHAnsi"/>
+        </w:rPr>
+      </w:pPr>
+      <w:r>
+        <w:rPr>
+          <w:rFonts w:cstheme="minorHAnsi"/>
+        </w:rPr>
+        <w:t>The best R-squared model was August 23B:</w:t>
+      </w:r>
+      <w:r>
+        <w:rPr>
+          <w:rFonts w:cstheme="minorHAnsi"/>
+        </w:rPr>
+        <w:br/>
+      </w:r>
+      <w:r>
+        <w:rPr>
+          <w:rFonts w:cstheme="minorHAnsi"/>
+        </w:rPr>
+        <w:br/>
+      </w:r>
+      <w:r>
+        <w:rPr>
+          <w:rFonts w:cstheme="minorHAnsi"/>
+        </w:rPr>
+        <w:drawing>
+          <wp:inline distT="0" distB="0" distL="0" distR="0" wp14:anchorId="2204C648" wp14:editId="2C377E37">
+            <wp:extent cx="5283472" cy="3219615"/>
+            <wp:effectExtent l="0" t="0" r="0" b="0"/>
+            <wp:docPr id="399843471" name="Picture 1"/>
+            <wp:cNvGraphicFramePr>
+              <a:graphicFrameLocks xmlns:a="http://schemas.openxmlformats.org/drawingml/2006/main" noChangeAspect="1"/>
+            </wp:cNvGraphicFramePr>
+            <a:graphic xmlns:a="http://schemas.openxmlformats.org/drawingml/2006/main">
+              <a:graphicData uri="http://schemas.openxmlformats.org/drawingml/2006/picture">
+                <pic:pic xmlns:pic="http://schemas.openxmlformats.org/drawingml/2006/picture">
+                  <pic:nvPicPr>
+                    <pic:cNvPr id="399843471" name=""/>
+                    <pic:cNvPicPr/>
+                  </pic:nvPicPr>
+                  <pic:blipFill>
+                    <a:blip r:embed="rId16"/>
+                    <a:stretch>
+                      <a:fillRect/>
+                    </a:stretch>
+                  </pic:blipFill>
+                  <pic:spPr>
+                    <a:xfrm>
+                      <a:off x="0" y="0"/>
+                      <a:ext cx="5283472" cy="3219615"/>
+                    </a:xfrm>
+                    <a:prstGeom prst="rect">
+                      <a:avLst/>
+                    </a:prstGeom>
+                  </pic:spPr>
+                </pic:pic>
+              </a:graphicData>
+            </a:graphic>
+          </wp:inline>
+        </w:drawing>
+      </w:r>
+    </w:p>
+    <w:p>
+      <w:pPr>
+        <w:pStyle w:val="ListParagraph"/>
+        <w:numPr>
+          <w:ilvl w:val="0"/>
+          <w:numId w:val="2"/>
+        </w:numPr>
+        <w:rPr>
+          <w:rFonts w:cstheme="minorHAnsi"/>
+        </w:rPr>
+      </w:pPr>
+      <w:r>
+        <w:rPr>
+          <w:rFonts w:cstheme="minorHAnsi"/>
+        </w:rPr>
+        <w:lastRenderedPageBreak/>
+        <w:t>When looking at the years more similar to 2025’s regulations (2021-2024):</w:t>
+      </w:r>
+      <w:r>
+        <w:rPr>
+          <w:rFonts w:cstheme="minorHAnsi"/>
+        </w:rPr>
+        <w:br/>
+      </w:r>
+      <w:r>
+        <w:rPr>
+          <w:rFonts w:cstheme="minorHAnsi"/>
+        </w:rPr>
+        <w:drawing>
+          <wp:inline distT="0" distB="0" distL="0" distR="0" wp14:anchorId="62B70BF8" wp14:editId="235312AB">
+            <wp:extent cx="5283472" cy="3187864"/>
+            <wp:effectExtent l="0" t="0" r="0" b="0"/>
+            <wp:docPr id="1537168271" name="Picture 1"/>
+            <wp:cNvGraphicFramePr>
+              <a:graphicFrameLocks xmlns:a="http://schemas.openxmlformats.org/drawingml/2006/main" noChangeAspect="1"/>
+            </wp:cNvGraphicFramePr>
+            <a:graphic xmlns:a="http://schemas.openxmlformats.org/drawingml/2006/main">
+              <a:graphicData uri="http://schemas.openxmlformats.org/drawingml/2006/picture">
+                <pic:pic xmlns:pic="http://schemas.openxmlformats.org/drawingml/2006/picture">
+                  <pic:nvPicPr>
+                    <pic:cNvPr id="1537168271" name=""/>
+                    <pic:cNvPicPr/>
+                  </pic:nvPicPr>
+                  <pic:blipFill>
+                    <a:blip r:embed="rId17"/>
+                    <a:stretch>
+                      <a:fillRect/>
+                    </a:stretch>
+                  </pic:blipFill>
+                  <pic:spPr>
+                    <a:xfrm>
+                      <a:off x="0" y="0"/>
+                      <a:ext cx="5283472" cy="3187864"/>
+                    </a:xfrm>
+                    <a:prstGeom prst="rect">
+                      <a:avLst/>
+                    </a:prstGeom>
+                  </pic:spPr>
+                </pic:pic>
+              </a:graphicData>
+            </a:graphic>
+          </wp:inline>
+        </w:drawing>
+      </w:r>
+      <w:r>
+        <w:rPr>
+          <w:rFonts w:cstheme="minorHAnsi"/>
+        </w:rPr>
+        <w:br/>
+      </w:r>
+      <w:r>
+        <w:rPr>
+          <w:rFonts w:cstheme="minorHAnsi"/>
+        </w:rPr>
+        <w:br/>
+      </w:r>
+    </w:p>
+    <w:p>
+      <w:pPr>
+        <w:pStyle w:val="ListParagraph"/>
+        <w:numPr>
+          <w:ilvl w:val="0"/>
+          <w:numId w:val="2"/>
+        </w:numPr>
+        <w:rPr>
+          <w:rFonts w:cstheme="minorHAnsi"/>
+        </w:rPr>
+      </w:pPr>
+      <w:r>
+        <w:rPr>
+          <w:rFonts w:cstheme="minorHAnsi"/>
+        </w:rPr>
+        <w:t>We see a shift In the relationship, and there are fewer data points. It looks negative for all the sub-areas and months analyzed in the first table as well.</w:t>
       </w:r>
     </w:p>
     <w:sectPr>
-      <w:headerReference w:type="even" r:id="rId16"/>
-      <w:headerReference w:type="default" r:id="rId17"/>
-      <w:headerReference w:type="first" r:id="rId18"/>
+      <w:headerReference w:type="even" r:id="rId18"/>
+      <w:headerReference w:type="default" r:id="rId19"/>
+      <w:headerReference w:type="first" r:id="rId20"/>
       <w:pgSz w:w="12240" w:h="15840"/>
       <w:pgMar w:top="1440" w:right="1440" w:bottom="1440" w:left="1440" w:header="720" w:footer="720" w:gutter="0"/>
       <w:cols w:space="720"/>
@@ -2029,6 +2203,119 @@
 <file path=word/numbering.xml><?xml version="1.0" encoding="utf-8"?>
 <w:numbering xmlns:wpc="http://schemas.microsoft.com/office/word/2010/wordprocessingCanvas" xmlns:cx="http://schemas.microsoft.com/office/drawing/2014/chartex" xmlns:cx1="http://schemas.microsoft.com/office/drawing/2015/9/8/chartex" xmlns:cx2="http://schemas.microsoft.com/office/drawing/2015/10/21/chartex" xmlns:cx3="http://schemas.microsoft.com/office/drawing/2016/5/9/chartex" xmlns:cx4="http://schemas.microsoft.com/office/drawing/2016/5/10/chartex" xmlns:cx5="http://schemas.microsoft.com/office/drawing/2016/5/11/chartex" xmlns:cx6="http://schemas.microsoft.com/office/drawing/2016/5/12/chartex" xmlns:cx7="http://schemas.microsoft.com/office/drawing/2016/5/13/chartex" xmlns:cx8="http://schemas.microsoft.com/office/drawing/2016/5/14/chartex" xmlns:mc="http://schemas.openxmlformats.org/markup-compatibility/2006" xmlns:aink="http://schemas.microsoft.com/office/drawing/2016/ink" xmlns:am3d="http://schemas.microsoft.com/office/drawing/2017/model3d" xmlns:o="urn:schemas-microsoft-com:office:office" xmlns:oel="http://schemas.microsoft.com/office/2019/extlst" xmlns:r="http://schemas.openxmlformats.org/officeDocument/2006/relationships" xmlns:m="http://schemas.openxmlformats.org/officeDocument/2006/math" xmlns:v="urn:schemas-microsoft-com:vml" xmlns:wp14="http://schemas.microsoft.com/office/word/2010/wordprocessingDrawing" xmlns:wp="http://schemas.openxmlformats.org/drawingml/2006/wordprocessingDrawing" xmlns:w10="urn:schemas-microsoft-com:office:word" xmlns:w="http://schemas.openxmlformats.org/wordprocessingml/2006/main" xmlns:w14="http://schemas.microsoft.com/office/word/2010/wordml" xmlns:w15="http://schemas.microsoft.com/office/word/2012/wordml" xmlns:w16cex="http://schemas.microsoft.com/office/word/2018/wordml/cex" xmlns:w16cid="http://schemas.microsoft.com/office/word/2016/wordml/cid" xmlns:w16="http://schemas.microsoft.com/office/word/2018/wordml" xmlns:w16sdtdh="http://schemas.microsoft.com/office/word/2020/wordml/sdtdatahash" xmlns:w16se="http://schemas.microsoft.com/office/word/2015/wordml/symex" xmlns:wpg="http://schemas.microsoft.com/office/word/2010/wordprocessingGroup" xmlns:wpi="http://schemas.microsoft.com/office/word/2010/wordprocessingInk" xmlns:wne="http://schemas.microsoft.com/office/word/2006/wordml" xmlns:wps="http://schemas.microsoft.com/office/word/2010/wordprocessingShape" mc:Ignorable="w14 w15 w16se w16cid w16 w16cex w16sdtdh wp14">
   <w:abstractNum w:abstractNumId="0" w15:restartNumberingAfterBreak="0">
+    <w:nsid w:val="336C7DC0"/>
+    <w:multiLevelType w:val="hybridMultilevel"/>
+    <w:tmpl w:val="F1B44212"/>
+    <w:lvl w:ilvl="0" w:tplc="04090001">
+      <w:start w:val="1"/>
+      <w:numFmt w:val="bullet"/>
+      <w:lvlText w:val=""/>
+      <w:lvlJc w:val="left"/>
+      <w:pPr>
+        <w:ind w:left="720" w:hanging="360"/>
+      </w:pPr>
+      <w:rPr>
+        <w:rFonts w:ascii="Symbol" w:hAnsi="Symbol" w:hint="default"/>
+      </w:rPr>
+    </w:lvl>
+    <w:lvl w:ilvl="1" w:tplc="04090003" w:tentative="1">
+      <w:start w:val="1"/>
+      <w:numFmt w:val="bullet"/>
+      <w:lvlText w:val="o"/>
+      <w:lvlJc w:val="left"/>
+      <w:pPr>
+        <w:ind w:left="1440" w:hanging="360"/>
+      </w:pPr>
+      <w:rPr>
+        <w:rFonts w:ascii="Courier New" w:hAnsi="Courier New" w:cs="Courier New" w:hint="default"/>
+      </w:rPr>
+    </w:lvl>
+    <w:lvl w:ilvl="2" w:tplc="04090005" w:tentative="1">
+      <w:start w:val="1"/>
+      <w:numFmt w:val="bullet"/>
+      <w:lvlText w:val=""/>
+      <w:lvlJc w:val="left"/>
+      <w:pPr>
+        <w:ind w:left="2160" w:hanging="360"/>
+      </w:pPr>
+      <w:rPr>
+        <w:rFonts w:ascii="Wingdings" w:hAnsi="Wingdings" w:hint="default"/>
+      </w:rPr>
+    </w:lvl>
+    <w:lvl w:ilvl="3" w:tplc="04090001" w:tentative="1">
+      <w:start w:val="1"/>
+      <w:numFmt w:val="bullet"/>
+      <w:lvlText w:val=""/>
+      <w:lvlJc w:val="left"/>
+      <w:pPr>
+        <w:ind w:left="2880" w:hanging="360"/>
+      </w:pPr>
+      <w:rPr>
+        <w:rFonts w:ascii="Symbol" w:hAnsi="Symbol" w:hint="default"/>
+      </w:rPr>
+    </w:lvl>
+    <w:lvl w:ilvl="4" w:tplc="04090003" w:tentative="1">
+      <w:start w:val="1"/>
+      <w:numFmt w:val="bullet"/>
+      <w:lvlText w:val="o"/>
+      <w:lvlJc w:val="left"/>
+      <w:pPr>
+        <w:ind w:left="3600" w:hanging="360"/>
+      </w:pPr>
+      <w:rPr>
+        <w:rFonts w:ascii="Courier New" w:hAnsi="Courier New" w:cs="Courier New" w:hint="default"/>
+      </w:rPr>
+    </w:lvl>
+    <w:lvl w:ilvl="5" w:tplc="04090005" w:tentative="1">
+      <w:start w:val="1"/>
+      <w:numFmt w:val="bullet"/>
+      <w:lvlText w:val=""/>
+      <w:lvlJc w:val="left"/>
+      <w:pPr>
+        <w:ind w:left="4320" w:hanging="360"/>
+      </w:pPr>
+      <w:rPr>
+        <w:rFonts w:ascii="Wingdings" w:hAnsi="Wingdings" w:hint="default"/>
+      </w:rPr>
+    </w:lvl>
+    <w:lvl w:ilvl="6" w:tplc="04090001" w:tentative="1">
+      <w:start w:val="1"/>
+      <w:numFmt w:val="bullet"/>
+      <w:lvlText w:val=""/>
+      <w:lvlJc w:val="left"/>
+      <w:pPr>
+        <w:ind w:left="5040" w:hanging="360"/>
+      </w:pPr>
+      <w:rPr>
+        <w:rFonts w:ascii="Symbol" w:hAnsi="Symbol" w:hint="default"/>
+      </w:rPr>
+    </w:lvl>
+    <w:lvl w:ilvl="7" w:tplc="04090003" w:tentative="1">
+      <w:start w:val="1"/>
+      <w:numFmt w:val="bullet"/>
+      <w:lvlText w:val="o"/>
+      <w:lvlJc w:val="left"/>
+      <w:pPr>
+        <w:ind w:left="5760" w:hanging="360"/>
+      </w:pPr>
+      <w:rPr>
+        <w:rFonts w:ascii="Courier New" w:hAnsi="Courier New" w:cs="Courier New" w:hint="default"/>
+      </w:rPr>
+    </w:lvl>
+    <w:lvl w:ilvl="8" w:tplc="04090005" w:tentative="1">
+      <w:start w:val="1"/>
+      <w:numFmt w:val="bullet"/>
+      <w:lvlText w:val=""/>
+      <w:lvlJc w:val="left"/>
+      <w:pPr>
+        <w:ind w:left="6480" w:hanging="360"/>
+      </w:pPr>
+      <w:rPr>
+        <w:rFonts w:ascii="Wingdings" w:hAnsi="Wingdings" w:hint="default"/>
+      </w:rPr>
+    </w:lvl>
+  </w:abstractNum>
+  <w:abstractNum w:abstractNumId="1" w15:restartNumberingAfterBreak="0">
     <w:nsid w:val="3F43335E"/>
     <w:multiLevelType w:val="hybridMultilevel"/>
     <w:tmpl w:val="CD4EDF54"/>
@@ -2142,6 +2429,9 @@
     </w:lvl>
   </w:abstractNum>
   <w:num w:numId="1" w16cid:durableId="977076561">
+    <w:abstractNumId w:val="1"/>
+  </w:num>
+  <w:num w:numId="2" w16cid:durableId="360980796">
     <w:abstractNumId w:val="0"/>
   </w:num>
 </w:numbering>
@@ -2634,6 +2924,17 @@
       </w:tblBorders>
     </w:tblPr>
   </w:style>
+  <w:style w:type="paragraph" w:styleId="ListParagraph">
+    <w:name w:val="List Paragraph"/>
+    <w:basedOn w:val="Normal"/>
+    <w:uiPriority w:val="34"/>
+    <w:qFormat/>
+    <w:rsid w:val="00B24033"/>
+    <w:pPr>
+      <w:ind w:left="720"/>
+      <w:contextualSpacing/>
+    </w:pPr>
+  </w:style>
 </w:styles>
 </file>
 

</xml_diff>